<commit_message>
docs(eval): align all testing and evaluation forms with proposal and chapter 4 draft
</commit_message>
<xml_diff>
--- a/docs/Client_Testing_and_ISO25010_End_User_Evaluation.docx
+++ b/docs/Client_Testing_and_ISO25010_End_User_Evaluation.docx
@@ -109,6 +109,17 @@
             <w:vAlign w:val="center"/>
           </w:tcPr>
           <w:p>
+            <w:r>
+              <w:t>Project / System Title: A.E.G.I.S: AI-ENHANCED GRANT INFORMATION SYSTEM WITH DOCUMENT FORENSICS AND AUTOMATED NOTIFICATION FOR THE OFFICE OF STUDENT AFFAIRS</w:t>
+            </w:r>
+          </w:p>
+        </w:tc>
+        <w:tc>
+          <w:tcPr>
+            <w:tcW w:w="4896" w:type="dxa"/>
+            <w:vAlign w:val="center"/>
+          </w:tcPr>
+          <w:p>
             <w:pPr>
               <w:spacing w:before="40" w:after="40" w:line="276" w:lineRule="auto"/>
               <w:jc w:val="left"/>
@@ -122,7 +133,7 @@
                 <w:color w:val="000000"/>
                 <w:sz w:val="19"/>
               </w:rPr>
-              <w:t>Project / System Title:</w:t>
+              <w:t>Client / Organization:</w:t>
               <w:br/>
             </w:r>
             <w:r>
@@ -133,10 +144,15 @@
                 <w:color w:val="000000"/>
                 <w:sz w:val="19"/>
               </w:rPr>
-              <w:t>A.E.G.I.S. (Automated Evaluation &amp; Grade Integrity System)</w:t>
-            </w:r>
-          </w:p>
-        </w:tc>
+              <w:t>Central Luzon State University — Office of Student Affairs (CLSU OSA)</w:t>
+            </w:r>
+          </w:p>
+        </w:tc>
+      </w:tr>
+      <w:tr>
+        <w:trPr>
+          <w:jc w:val="center"/>
+        </w:trPr>
         <w:tc>
           <w:tcPr>
             <w:tcW w:w="4896" w:type="dxa"/>
@@ -156,7 +172,7 @@
                 <w:color w:val="000000"/>
                 <w:sz w:val="19"/>
               </w:rPr>
-              <w:t>Client / Organization:</w:t>
+              <w:t>Client Representative:</w:t>
               <w:br/>
             </w:r>
             <w:r>
@@ -167,7 +183,41 @@
                 <w:color w:val="000000"/>
                 <w:sz w:val="19"/>
               </w:rPr>
-              <w:t>Central Luzon State University — Office of Student Affairs (CLSU OSA)</w:t>
+              <w:t>________________________________________ (OSA Director / Evaluator)</w:t>
+            </w:r>
+          </w:p>
+        </w:tc>
+        <w:tc>
+          <w:tcPr>
+            <w:tcW w:w="4896" w:type="dxa"/>
+            <w:vAlign w:val="center"/>
+          </w:tcPr>
+          <w:p>
+            <w:pPr>
+              <w:spacing w:before="40" w:after="40" w:line="276" w:lineRule="auto"/>
+              <w:jc w:val="left"/>
+            </w:pPr>
+            <w:r/>
+            <w:r>
+              <w:rPr>
+                <w:rFonts w:ascii="Calibri" w:hAnsi="Calibri"/>
+                <w:b/>
+                <w:i w:val="0"/>
+                <w:color w:val="000000"/>
+                <w:sz w:val="19"/>
+              </w:rPr>
+              <w:t>Position / Role:</w:t>
+              <w:br/>
+            </w:r>
+            <w:r>
+              <w:rPr>
+                <w:rFonts w:ascii="Calibri" w:hAnsi="Calibri"/>
+                <w:b w:val="0"/>
+                <w:i w:val="0"/>
+                <w:color w:val="000000"/>
+                <w:sz w:val="19"/>
+              </w:rPr>
+              <w:t>Director / Scholarship Coordinator / Evaluator</w:t>
             </w:r>
           </w:p>
         </w:tc>
@@ -195,7 +245,7 @@
                 <w:color w:val="000000"/>
                 <w:sz w:val="19"/>
               </w:rPr>
-              <w:t>Client Representative:</w:t>
+              <w:t>Date of Testing:</w:t>
               <w:br/>
             </w:r>
             <w:r>
@@ -206,7 +256,7 @@
                 <w:color w:val="000000"/>
                 <w:sz w:val="19"/>
               </w:rPr>
-              <w:t>________________________________________ (OSA Director / Evaluator)</w:t>
+              <w:t>October 2026</w:t>
             </w:r>
           </w:p>
         </w:tc>
@@ -229,7 +279,7 @@
                 <w:color w:val="000000"/>
                 <w:sz w:val="19"/>
               </w:rPr>
-              <w:t>Position / Role:</w:t>
+              <w:t>System Version / Build:</w:t>
               <w:br/>
             </w:r>
             <w:r>
@@ -240,7 +290,7 @@
                 <w:color w:val="000000"/>
                 <w:sz w:val="19"/>
               </w:rPr>
-              <w:t>Director / Scholarship Coordinator / Evaluator</w:t>
+              <w:t>A.E.G.I.S. v1.0.0 (Cloud Staging Deployment)</w:t>
             </w:r>
           </w:p>
         </w:tc>
@@ -268,7 +318,7 @@
                 <w:color w:val="000000"/>
                 <w:sz w:val="19"/>
               </w:rPr>
-              <w:t>Date of Testing:</w:t>
+              <w:t>Testing Location / Platform:</w:t>
               <w:br/>
             </w:r>
             <w:r>
@@ -279,7 +329,7 @@
                 <w:color w:val="000000"/>
                 <w:sz w:val="19"/>
               </w:rPr>
-              <w:t>October 2026</w:t>
+              <w:t>CLSU OSA Office / Web Platform (https://aegis-capstone.onrender.com)</w:t>
             </w:r>
           </w:p>
         </w:tc>
@@ -293,100 +343,10 @@
               <w:spacing w:before="40" w:after="40" w:line="276" w:lineRule="auto"/>
               <w:jc w:val="left"/>
             </w:pPr>
-            <w:r/>
-            <w:r>
-              <w:rPr>
-                <w:rFonts w:ascii="Calibri" w:hAnsi="Calibri"/>
-                <w:b/>
-                <w:i w:val="0"/>
-                <w:color w:val="000000"/>
-                <w:sz w:val="19"/>
-              </w:rPr>
-              <w:t>System Version / Build:</w:t>
-              <w:br/>
-            </w:r>
-            <w:r>
-              <w:rPr>
-                <w:rFonts w:ascii="Calibri" w:hAnsi="Calibri"/>
-                <w:b w:val="0"/>
-                <w:i w:val="0"/>
-                <w:color w:val="000000"/>
-                <w:sz w:val="19"/>
-              </w:rPr>
-              <w:t>A.E.G.I.S. v1.0.0 (Cloud Staging Deployment)</w:t>
-            </w:r>
-          </w:p>
-        </w:tc>
-      </w:tr>
-      <w:tr>
-        <w:trPr>
-          <w:jc w:val="center"/>
-        </w:trPr>
-        <w:tc>
-          <w:tcPr>
-            <w:tcW w:w="4896" w:type="dxa"/>
-            <w:vAlign w:val="center"/>
-          </w:tcPr>
-          <w:p>
-            <w:pPr>
-              <w:spacing w:before="40" w:after="40" w:line="276" w:lineRule="auto"/>
-              <w:jc w:val="left"/>
-            </w:pPr>
-            <w:r/>
-            <w:r>
-              <w:rPr>
-                <w:rFonts w:ascii="Calibri" w:hAnsi="Calibri"/>
-                <w:b/>
-                <w:i w:val="0"/>
-                <w:color w:val="000000"/>
-                <w:sz w:val="19"/>
-              </w:rPr>
-              <w:t>Testing Location / Platform:</w:t>
-              <w:br/>
-            </w:r>
-            <w:r>
-              <w:rPr>
-                <w:rFonts w:ascii="Calibri" w:hAnsi="Calibri"/>
-                <w:b w:val="0"/>
-                <w:i w:val="0"/>
-                <w:color w:val="000000"/>
-                <w:sz w:val="19"/>
-              </w:rPr>
-              <w:t>CLSU OSA Office / Web Platform (https://aegis-capstone.onrender.com)</w:t>
-            </w:r>
-          </w:p>
-        </w:tc>
-        <w:tc>
-          <w:tcPr>
-            <w:tcW w:w="4896" w:type="dxa"/>
-            <w:vAlign w:val="center"/>
-          </w:tcPr>
-          <w:p>
-            <w:pPr>
-              <w:spacing w:before="40" w:after="40" w:line="276" w:lineRule="auto"/>
-              <w:jc w:val="left"/>
-            </w:pPr>
-            <w:r/>
-            <w:r>
-              <w:rPr>
-                <w:rFonts w:ascii="Calibri" w:hAnsi="Calibri"/>
-                <w:b/>
-                <w:i w:val="0"/>
-                <w:color w:val="000000"/>
-                <w:sz w:val="19"/>
-              </w:rPr>
+            <w:r>
               <w:t>Development Team / Group:</w:t>
               <w:br/>
-            </w:r>
-            <w:r>
-              <w:rPr>
-                <w:rFonts w:ascii="Calibri" w:hAnsi="Calibri"/>
-                <w:b w:val="0"/>
-                <w:i w:val="0"/>
-                <w:color w:val="000000"/>
-                <w:sz w:val="19"/>
-              </w:rPr>
-              <w:t>Joshua Razon, Noriel Gadiano, John Andrei Carillo II (BSIT 4-1)</w:t>
+              <w:t>John Andrei Carillo, Noriel S. Gadiano, Joshua A. Razon (BSIT 4-1)</w:t>
             </w:r>
           </w:p>
         </w:tc>
@@ -1240,15 +1200,92 @@
             <w:tcW w:w="1440" w:type="dxa"/>
           </w:tcPr>
           <w:p>
+            <w:r>
+              <w:t>AI Document Forensics &amp; ELA-CNN Tamper Detection</w:t>
+            </w:r>
+          </w:p>
+        </w:tc>
+        <w:tc>
+          <w:tcPr>
+            <w:tcW w:w="2088" w:type="dxa"/>
+          </w:tcPr>
+          <w:p>
+            <w:r>
+              <w:t>Upload Certificate of Grades (COG) with digitally altered grades or cloned seals. Execute ELA-CNN dual pipeline (Error Level Analysis at Q=95 + ResNet-50 classifier) and inspect Grad-CAM explainability heatmap.</w:t>
+            </w:r>
+          </w:p>
+        </w:tc>
+        <w:tc>
+          <w:tcPr>
+            <w:tcW w:w="1872" w:type="dxa"/>
+          </w:tcPr>
+          <w:p>
+            <w:r>
+              <w:t>System computes normalized ELA map, returns Fraud Probability Score (0–100%), categorizes into risk tier (Low: 0–39%, Moderate: 40–69%, High: 70–100%), renders Grad-CAM heatmap highlighting tampered grade/seal regions, and serves as decision-support for human evaluator.</w:t>
+            </w:r>
+          </w:p>
+        </w:tc>
+        <w:tc>
+          <w:tcPr>
+            <w:tcW w:w="1872" w:type="dxa"/>
+          </w:tcPr>
+          <w:p>
             <w:pPr>
               <w:spacing w:before="40" w:after="40" w:line="276" w:lineRule="auto"/>
               <w:jc w:val="left"/>
             </w:pPr>
-            <w:r>
-              <w:rPr>
-                <w:b/>
-              </w:rPr>
-            </w:r>
+            <w:r/>
+          </w:p>
+        </w:tc>
+        <w:tc>
+          <w:tcPr>
+            <w:tcW w:w="1512" w:type="dxa"/>
+          </w:tcPr>
+          <w:p>
+            <w:pPr>
+              <w:spacing w:before="40" w:after="40" w:line="276" w:lineRule="auto"/>
+              <w:jc w:val="left"/>
+            </w:pPr>
+            <w:r/>
+            <w:r>
+              <w:rPr>
+                <w:rFonts w:ascii="Calibri" w:hAnsi="Calibri"/>
+                <w:b w:val="0"/>
+                <w:i w:val="0"/>
+                <w:color w:val="000000"/>
+                <w:sz w:val="16"/>
+              </w:rPr>
+              <w:t>☐ Pass  ☐ Fail  ☐ Needs Revision  ☐ N/A</w:t>
+            </w:r>
+          </w:p>
+        </w:tc>
+        <w:tc>
+          <w:tcPr>
+            <w:tcW w:w="1512" w:type="dxa"/>
+          </w:tcPr>
+          <w:p>
+            <w:pPr>
+              <w:spacing w:before="40" w:after="40" w:line="276" w:lineRule="auto"/>
+              <w:jc w:val="left"/>
+            </w:pPr>
+            <w:r/>
+          </w:p>
+        </w:tc>
+      </w:tr>
+      <w:tr>
+        <w:trPr>
+          <w:jc w:val="center"/>
+        </w:trPr>
+        <w:tc>
+          <w:tcPr>
+            <w:tcW w:w="503" w:type="dxa"/>
+          </w:tcPr>
+          <w:p>
+            <w:pPr>
+              <w:spacing w:before="40" w:after="40" w:line="276" w:lineRule="auto"/>
+              <w:jc w:val="center"/>
+            </w:pPr>
+            <w:r/>
             <w:r>
               <w:rPr>
                 <w:rFonts w:ascii="Calibri" w:hAnsi="Calibri"/>
@@ -1257,7 +1294,33 @@
                 <w:color w:val="000000"/>
                 <w:sz w:val="18"/>
               </w:rPr>
-              <w:t>AI Document Forensics &amp; Tamper Detection</w:t>
+              <w:t>6</w:t>
+            </w:r>
+          </w:p>
+        </w:tc>
+        <w:tc>
+          <w:tcPr>
+            <w:tcW w:w="1440" w:type="dxa"/>
+          </w:tcPr>
+          <w:p>
+            <w:pPr>
+              <w:spacing w:before="40" w:after="40" w:line="276" w:lineRule="auto"/>
+              <w:jc w:val="left"/>
+            </w:pPr>
+            <w:r>
+              <w:rPr>
+                <w:b/>
+              </w:rPr>
+            </w:r>
+            <w:r>
+              <w:rPr>
+                <w:rFonts w:ascii="Calibri" w:hAnsi="Calibri"/>
+                <w:b w:val="0"/>
+                <w:i w:val="0"/>
+                <w:color w:val="000000"/>
+                <w:sz w:val="18"/>
+              </w:rPr>
+              <w:t>Staff Application Review &amp; Triage Queue</w:t>
             </w:r>
           </w:p>
         </w:tc>
@@ -1279,7 +1342,7 @@
                 <w:color w:val="000000"/>
                 <w:sz w:val="17"/>
               </w:rPr>
-              <w:t>Execute dual-pipeline forensic scan (Error Level Analysis + ResNet-50 CNN) on submitted grade certificate document images.</w:t>
+              <w:t>Staff Evaluator logs into administrative portal, searches application queue by Student ID or Program, and opens deep-dive review canvas.</w:t>
             </w:r>
           </w:p>
         </w:tc>
@@ -1301,7 +1364,7 @@
                 <w:color w:val="000000"/>
                 <w:sz w:val="17"/>
               </w:rPr>
-              <w:t>System renders interactive forensic heatmaps, identifies manipulated/resampled regions, detects editing software metadata, and assigns Fraud Risk Score.</w:t>
+              <w:t>Review interface displays side-by-side document viewer with zoom/invert controls, forensic overlays, OCR extracted grades, and triage tools.</w:t>
             </w:r>
           </w:p>
         </w:tc>
@@ -1374,24 +1437,101 @@
                 <w:color w:val="000000"/>
                 <w:sz w:val="18"/>
               </w:rPr>
-              <w:t>6</w:t>
+              <w:t>7</w:t>
             </w:r>
           </w:p>
         </w:tc>
         <w:tc>
           <w:tcPr>
             <w:tcW w:w="1440" w:type="dxa"/>
+          </w:tcPr>
+          <w:p>
+            <w:r>
+              <w:t>Scholarship Award Determination &amp; Automated Notifications</w:t>
+            </w:r>
+          </w:p>
+        </w:tc>
+        <w:tc>
+          <w:tcPr>
+            <w:tcW w:w="2088" w:type="dxa"/>
+          </w:tcPr>
+          <w:p>
+            <w:r>
+              <w:t>Staff Evaluator assesses student credentials with AI decision support and renders official decision (Approved / Rejected / Returned for Correction with mandatory remarks).</w:t>
+            </w:r>
+          </w:p>
+        </w:tc>
+        <w:tc>
+          <w:tcPr>
+            <w:tcW w:w="1872" w:type="dxa"/>
+          </w:tcPr>
+          <w:p>
+            <w:r>
+              <w:t>Decision recorded in database; scholarship quota counter updates; automated SMTP email notification dispatched immediately to applicant; live in-app notification bell drawer updates with unread badge.</w:t>
+            </w:r>
+          </w:p>
+        </w:tc>
+        <w:tc>
+          <w:tcPr>
+            <w:tcW w:w="1872" w:type="dxa"/>
           </w:tcPr>
           <w:p>
             <w:pPr>
               <w:spacing w:before="40" w:after="40" w:line="276" w:lineRule="auto"/>
               <w:jc w:val="left"/>
             </w:pPr>
-            <w:r>
-              <w:rPr>
-                <w:b/>
-              </w:rPr>
-            </w:r>
+            <w:r/>
+          </w:p>
+        </w:tc>
+        <w:tc>
+          <w:tcPr>
+            <w:tcW w:w="1512" w:type="dxa"/>
+          </w:tcPr>
+          <w:p>
+            <w:pPr>
+              <w:spacing w:before="40" w:after="40" w:line="276" w:lineRule="auto"/>
+              <w:jc w:val="left"/>
+            </w:pPr>
+            <w:r/>
+            <w:r>
+              <w:rPr>
+                <w:rFonts w:ascii="Calibri" w:hAnsi="Calibri"/>
+                <w:b w:val="0"/>
+                <w:i w:val="0"/>
+                <w:color w:val="000000"/>
+                <w:sz w:val="16"/>
+              </w:rPr>
+              <w:t>☐ Pass  ☐ Fail  ☐ Needs Revision  ☐ N/A</w:t>
+            </w:r>
+          </w:p>
+        </w:tc>
+        <w:tc>
+          <w:tcPr>
+            <w:tcW w:w="1512" w:type="dxa"/>
+          </w:tcPr>
+          <w:p>
+            <w:pPr>
+              <w:spacing w:before="40" w:after="40" w:line="276" w:lineRule="auto"/>
+              <w:jc w:val="left"/>
+            </w:pPr>
+            <w:r/>
+          </w:p>
+        </w:tc>
+      </w:tr>
+      <w:tr>
+        <w:trPr>
+          <w:jc w:val="center"/>
+        </w:trPr>
+        <w:tc>
+          <w:tcPr>
+            <w:tcW w:w="503" w:type="dxa"/>
+          </w:tcPr>
+          <w:p>
+            <w:pPr>
+              <w:spacing w:before="40" w:after="40" w:line="276" w:lineRule="auto"/>
+              <w:jc w:val="center"/>
+            </w:pPr>
+            <w:r/>
             <w:r>
               <w:rPr>
                 <w:rFonts w:ascii="Calibri" w:hAnsi="Calibri"/>
@@ -1400,7 +1540,136 @@
                 <w:color w:val="000000"/>
                 <w:sz w:val="18"/>
               </w:rPr>
-              <w:t>Staff Application Review &amp; Triage Queue</w:t>
+              <w:t>8</w:t>
+            </w:r>
+          </w:p>
+        </w:tc>
+        <w:tc>
+          <w:tcPr>
+            <w:tcW w:w="1440" w:type="dxa"/>
+          </w:tcPr>
+          <w:p>
+            <w:r>
+              <w:t>Official Applicant Evaluation Form PDF Generation &amp; Print Engine</w:t>
+            </w:r>
+          </w:p>
+        </w:tc>
+        <w:tc>
+          <w:tcPr>
+            <w:tcW w:w="2088" w:type="dxa"/>
+          </w:tcPr>
+          <w:p>
+            <w:r>
+              <w:t>Generate, preview, and print the official approved scholarship evaluation form (1-page letter format) with student details, verification checklist, signatures, and tamper-evident clearance badge.</w:t>
+            </w:r>
+          </w:p>
+        </w:tc>
+        <w:tc>
+          <w:tcPr>
+            <w:tcW w:w="1872" w:type="dxa"/>
+          </w:tcPr>
+          <w:p>
+            <w:r>
+              <w:t>High-fidelity 1-page letter PDF generated matching the web preview 1:1 with official CLSU OSA seal, clearance badge, cryptographic verification link, isolated iframe print engine, and director signature line.</w:t>
+            </w:r>
+          </w:p>
+        </w:tc>
+        <w:tc>
+          <w:tcPr>
+            <w:tcW w:w="1872" w:type="dxa"/>
+          </w:tcPr>
+          <w:p>
+            <w:pPr>
+              <w:spacing w:before="40" w:after="40" w:line="276" w:lineRule="auto"/>
+              <w:jc w:val="left"/>
+            </w:pPr>
+            <w:r/>
+          </w:p>
+        </w:tc>
+        <w:tc>
+          <w:tcPr>
+            <w:tcW w:w="1512" w:type="dxa"/>
+          </w:tcPr>
+          <w:p>
+            <w:pPr>
+              <w:spacing w:before="40" w:after="40" w:line="276" w:lineRule="auto"/>
+              <w:jc w:val="left"/>
+            </w:pPr>
+            <w:r/>
+            <w:r>
+              <w:rPr>
+                <w:rFonts w:ascii="Calibri" w:hAnsi="Calibri"/>
+                <w:b w:val="0"/>
+                <w:i w:val="0"/>
+                <w:color w:val="000000"/>
+                <w:sz w:val="16"/>
+              </w:rPr>
+              <w:t>☐ Pass  ☐ Fail  ☐ Needs Revision  ☐ N/A</w:t>
+            </w:r>
+          </w:p>
+        </w:tc>
+        <w:tc>
+          <w:tcPr>
+            <w:tcW w:w="1512" w:type="dxa"/>
+          </w:tcPr>
+          <w:p>
+            <w:pPr>
+              <w:spacing w:before="40" w:after="40" w:line="276" w:lineRule="auto"/>
+              <w:jc w:val="left"/>
+            </w:pPr>
+            <w:r/>
+          </w:p>
+        </w:tc>
+      </w:tr>
+      <w:tr>
+        <w:trPr>
+          <w:jc w:val="center"/>
+        </w:trPr>
+        <w:tc>
+          <w:tcPr>
+            <w:tcW w:w="503" w:type="dxa"/>
+          </w:tcPr>
+          <w:p>
+            <w:pPr>
+              <w:spacing w:before="40" w:after="40" w:line="276" w:lineRule="auto"/>
+              <w:jc w:val="center"/>
+            </w:pPr>
+            <w:r/>
+            <w:r>
+              <w:rPr>
+                <w:rFonts w:ascii="Calibri" w:hAnsi="Calibri"/>
+                <w:b w:val="0"/>
+                <w:i w:val="0"/>
+                <w:color w:val="000000"/>
+                <w:sz w:val="18"/>
+              </w:rPr>
+              <w:t>9</w:t>
+            </w:r>
+          </w:p>
+        </w:tc>
+        <w:tc>
+          <w:tcPr>
+            <w:tcW w:w="1440" w:type="dxa"/>
+          </w:tcPr>
+          <w:p>
+            <w:pPr>
+              <w:spacing w:before="40" w:after="40" w:line="276" w:lineRule="auto"/>
+              <w:jc w:val="left"/>
+            </w:pPr>
+            <w:r>
+              <w:rPr>
+                <w:b/>
+              </w:rPr>
+            </w:r>
+            <w:r>
+              <w:rPr>
+                <w:rFonts w:ascii="Calibri" w:hAnsi="Calibri"/>
+                <w:b w:val="0"/>
+                <w:i w:val="0"/>
+                <w:color w:val="000000"/>
+                <w:sz w:val="18"/>
+              </w:rPr>
+              <w:t>Role-Based Access Control &amp; 2FA Device Management</w:t>
             </w:r>
           </w:p>
         </w:tc>
@@ -1422,7 +1691,7 @@
                 <w:color w:val="000000"/>
                 <w:sz w:val="17"/>
               </w:rPr>
-              <w:t>Staff Evaluator logs into administrative portal, searches application queue by Student ID or Program, and opens deep-dive review canvas.</w:t>
+              <w:t>Verify authorization barriers between Student, Staff Evaluator, and Director roles, and test multi-factor authentication controls.</w:t>
             </w:r>
           </w:p>
         </w:tc>
@@ -1444,7 +1713,7 @@
                 <w:color w:val="000000"/>
                 <w:sz w:val="17"/>
               </w:rPr>
-              <w:t>Review interface displays side-by-side document viewer with zoom/invert controls, forensic overlays, OCR extracted grades, and triage tools.</w:t>
+              <w:t>Unauthorized route access is blocked with strict HTTP 403 Forbidden; staff and director administrative controls remain inaccessible to students.</w:t>
             </w:r>
           </w:p>
         </w:tc>
@@ -1517,7 +1786,7 @@
                 <w:color w:val="000000"/>
                 <w:sz w:val="18"/>
               </w:rPr>
-              <w:t>7</w:t>
+              <w:t>10</w:t>
             </w:r>
           </w:p>
         </w:tc>
@@ -1526,24 +1795,8 @@
             <w:tcW w:w="1440" w:type="dxa"/>
           </w:tcPr>
           <w:p>
-            <w:pPr>
-              <w:spacing w:before="40" w:after="40" w:line="276" w:lineRule="auto"/>
-              <w:jc w:val="left"/>
-            </w:pPr>
-            <w:r>
-              <w:rPr>
-                <w:b/>
-              </w:rPr>
-            </w:r>
-            <w:r>
-              <w:rPr>
-                <w:rFonts w:ascii="Calibri" w:hAnsi="Calibri"/>
-                <w:b w:val="0"/>
-                <w:i w:val="0"/>
-                <w:color w:val="000000"/>
-                <w:sz w:val="18"/>
-              </w:rPr>
-              <w:t>Scholarship Award Determination &amp; Status Notification</w:t>
+            <w:r>
+              <w:t>Executive KPI Analytics &amp; Compliance Export (CHED/DOST-SEI)</w:t>
             </w:r>
           </w:p>
         </w:tc>
@@ -1552,20 +1805,8 @@
             <w:tcW w:w="2088" w:type="dxa"/>
           </w:tcPr>
           <w:p>
-            <w:pPr>
-              <w:spacing w:before="40" w:after="40" w:line="276" w:lineRule="auto"/>
-              <w:jc w:val="left"/>
-            </w:pPr>
-            <w:r/>
-            <w:r>
-              <w:rPr>
-                <w:rFonts w:ascii="Calibri" w:hAnsi="Calibri"/>
-                <w:b w:val="0"/>
-                <w:i w:val="0"/>
-                <w:color w:val="000000"/>
-                <w:sz w:val="17"/>
-              </w:rPr>
-              <w:t>Staff Evaluator assesses student credentials and renders official decision (Approve / Return for Correction / Revoke with remarks).</w:t>
+            <w:r>
+              <w:t>Director reviews system analytics dashboard (scholarship quota utilization progress, applicant distributions) and exports audit compliance reports in CSV and PDF formats.</w:t>
             </w:r>
           </w:p>
         </w:tc>
@@ -1574,449 +1815,8 @@
             <w:tcW w:w="1872" w:type="dxa"/>
           </w:tcPr>
           <w:p>
-            <w:pPr>
-              <w:spacing w:before="40" w:after="40" w:line="276" w:lineRule="auto"/>
-              <w:jc w:val="left"/>
-            </w:pPr>
-            <w:r/>
-            <w:r>
-              <w:rPr>
-                <w:rFonts w:ascii="Calibri" w:hAnsi="Calibri"/>
-                <w:b w:val="0"/>
-                <w:i w:val="0"/>
-                <w:color w:val="000000"/>
-                <w:sz w:val="17"/>
-              </w:rPr>
-              <w:t>Decision is recorded in database, scholarship quota updates, and transactional decision email with official remarks is dispatched to student.</w:t>
-            </w:r>
-          </w:p>
-        </w:tc>
-        <w:tc>
-          <w:tcPr>
-            <w:tcW w:w="1872" w:type="dxa"/>
-          </w:tcPr>
-          <w:p>
-            <w:pPr>
-              <w:spacing w:before="40" w:after="40" w:line="276" w:lineRule="auto"/>
-              <w:jc w:val="left"/>
-            </w:pPr>
-            <w:r/>
-          </w:p>
-        </w:tc>
-        <w:tc>
-          <w:tcPr>
-            <w:tcW w:w="1512" w:type="dxa"/>
-          </w:tcPr>
-          <w:p>
-            <w:pPr>
-              <w:spacing w:before="40" w:after="40" w:line="276" w:lineRule="auto"/>
-              <w:jc w:val="left"/>
-            </w:pPr>
-            <w:r/>
-            <w:r>
-              <w:rPr>
-                <w:rFonts w:ascii="Calibri" w:hAnsi="Calibri"/>
-                <w:b w:val="0"/>
-                <w:i w:val="0"/>
-                <w:color w:val="000000"/>
-                <w:sz w:val="16"/>
-              </w:rPr>
-              <w:t>☐ Pass  ☐ Fail  ☐ Needs Revision  ☐ N/A</w:t>
-            </w:r>
-          </w:p>
-        </w:tc>
-        <w:tc>
-          <w:tcPr>
-            <w:tcW w:w="1512" w:type="dxa"/>
-          </w:tcPr>
-          <w:p>
-            <w:pPr>
-              <w:spacing w:before="40" w:after="40" w:line="276" w:lineRule="auto"/>
-              <w:jc w:val="left"/>
-            </w:pPr>
-            <w:r/>
-          </w:p>
-        </w:tc>
-      </w:tr>
-      <w:tr>
-        <w:trPr>
-          <w:jc w:val="center"/>
-        </w:trPr>
-        <w:tc>
-          <w:tcPr>
-            <w:tcW w:w="503" w:type="dxa"/>
-          </w:tcPr>
-          <w:p>
-            <w:pPr>
-              <w:spacing w:before="40" w:after="40" w:line="276" w:lineRule="auto"/>
-              <w:jc w:val="center"/>
-            </w:pPr>
-            <w:r/>
-            <w:r>
-              <w:rPr>
-                <w:rFonts w:ascii="Calibri" w:hAnsi="Calibri"/>
-                <w:b w:val="0"/>
-                <w:i w:val="0"/>
-                <w:color w:val="000000"/>
-                <w:sz w:val="18"/>
-              </w:rPr>
-              <w:t>8</w:t>
-            </w:r>
-          </w:p>
-        </w:tc>
-        <w:tc>
-          <w:tcPr>
-            <w:tcW w:w="1440" w:type="dxa"/>
-          </w:tcPr>
-          <w:p>
-            <w:pPr>
-              <w:spacing w:before="40" w:after="40" w:line="276" w:lineRule="auto"/>
-              <w:jc w:val="left"/>
-            </w:pPr>
-            <w:r>
-              <w:rPr>
-                <w:b/>
-              </w:rPr>
-            </w:r>
-            <w:r>
-              <w:rPr>
-                <w:rFonts w:ascii="Calibri" w:hAnsi="Calibri"/>
-                <w:b w:val="0"/>
-                <w:i w:val="0"/>
-                <w:color w:val="000000"/>
-                <w:sz w:val="18"/>
-              </w:rPr>
-              <w:t>Official Scholarship Form PDF Generation &amp; Verification</w:t>
-            </w:r>
-          </w:p>
-        </w:tc>
-        <w:tc>
-          <w:tcPr>
-            <w:tcW w:w="2088" w:type="dxa"/>
-          </w:tcPr>
-          <w:p>
-            <w:pPr>
-              <w:spacing w:before="40" w:after="40" w:line="276" w:lineRule="auto"/>
-              <w:jc w:val="left"/>
-            </w:pPr>
-            <w:r/>
-            <w:r>
-              <w:rPr>
-                <w:rFonts w:ascii="Calibri" w:hAnsi="Calibri"/>
-                <w:b w:val="0"/>
-                <w:i w:val="0"/>
-                <w:color w:val="000000"/>
-                <w:sz w:val="17"/>
-              </w:rPr>
-              <w:t>Generate and download the official approved scholarship certificate/form with student details, grant allocation, and validation seal.</w:t>
-            </w:r>
-          </w:p>
-        </w:tc>
-        <w:tc>
-          <w:tcPr>
-            <w:tcW w:w="1872" w:type="dxa"/>
-          </w:tcPr>
-          <w:p>
-            <w:pPr>
-              <w:spacing w:before="40" w:after="40" w:line="276" w:lineRule="auto"/>
-              <w:jc w:val="left"/>
-            </w:pPr>
-            <w:r/>
-            <w:r>
-              <w:rPr>
-                <w:rFonts w:ascii="Calibri" w:hAnsi="Calibri"/>
-                <w:b w:val="0"/>
-                <w:i w:val="0"/>
-                <w:color w:val="000000"/>
-                <w:sz w:val="17"/>
-              </w:rPr>
-              <w:t>Vector PDF renders cleanly with official CLSU OSA seal, QR verification code, cryptographic verification link, and director signature line.</w:t>
-            </w:r>
-          </w:p>
-        </w:tc>
-        <w:tc>
-          <w:tcPr>
-            <w:tcW w:w="1872" w:type="dxa"/>
-          </w:tcPr>
-          <w:p>
-            <w:pPr>
-              <w:spacing w:before="40" w:after="40" w:line="276" w:lineRule="auto"/>
-              <w:jc w:val="left"/>
-            </w:pPr>
-            <w:r/>
-          </w:p>
-        </w:tc>
-        <w:tc>
-          <w:tcPr>
-            <w:tcW w:w="1512" w:type="dxa"/>
-          </w:tcPr>
-          <w:p>
-            <w:pPr>
-              <w:spacing w:before="40" w:after="40" w:line="276" w:lineRule="auto"/>
-              <w:jc w:val="left"/>
-            </w:pPr>
-            <w:r/>
-            <w:r>
-              <w:rPr>
-                <w:rFonts w:ascii="Calibri" w:hAnsi="Calibri"/>
-                <w:b w:val="0"/>
-                <w:i w:val="0"/>
-                <w:color w:val="000000"/>
-                <w:sz w:val="16"/>
-              </w:rPr>
-              <w:t>☐ Pass  ☐ Fail  ☐ Needs Revision  ☐ N/A</w:t>
-            </w:r>
-          </w:p>
-        </w:tc>
-        <w:tc>
-          <w:tcPr>
-            <w:tcW w:w="1512" w:type="dxa"/>
-          </w:tcPr>
-          <w:p>
-            <w:pPr>
-              <w:spacing w:before="40" w:after="40" w:line="276" w:lineRule="auto"/>
-              <w:jc w:val="left"/>
-            </w:pPr>
-            <w:r/>
-          </w:p>
-        </w:tc>
-      </w:tr>
-      <w:tr>
-        <w:trPr>
-          <w:jc w:val="center"/>
-        </w:trPr>
-        <w:tc>
-          <w:tcPr>
-            <w:tcW w:w="503" w:type="dxa"/>
-          </w:tcPr>
-          <w:p>
-            <w:pPr>
-              <w:spacing w:before="40" w:after="40" w:line="276" w:lineRule="auto"/>
-              <w:jc w:val="center"/>
-            </w:pPr>
-            <w:r/>
-            <w:r>
-              <w:rPr>
-                <w:rFonts w:ascii="Calibri" w:hAnsi="Calibri"/>
-                <w:b w:val="0"/>
-                <w:i w:val="0"/>
-                <w:color w:val="000000"/>
-                <w:sz w:val="18"/>
-              </w:rPr>
-              <w:t>9</w:t>
-            </w:r>
-          </w:p>
-        </w:tc>
-        <w:tc>
-          <w:tcPr>
-            <w:tcW w:w="1440" w:type="dxa"/>
-          </w:tcPr>
-          <w:p>
-            <w:pPr>
-              <w:spacing w:before="40" w:after="40" w:line="276" w:lineRule="auto"/>
-              <w:jc w:val="left"/>
-            </w:pPr>
-            <w:r>
-              <w:rPr>
-                <w:b/>
-              </w:rPr>
-            </w:r>
-            <w:r>
-              <w:rPr>
-                <w:rFonts w:ascii="Calibri" w:hAnsi="Calibri"/>
-                <w:b w:val="0"/>
-                <w:i w:val="0"/>
-                <w:color w:val="000000"/>
-                <w:sz w:val="18"/>
-              </w:rPr>
-              <w:t>Role-Based Access Control &amp; 2FA Device Management</w:t>
-            </w:r>
-          </w:p>
-        </w:tc>
-        <w:tc>
-          <w:tcPr>
-            <w:tcW w:w="2088" w:type="dxa"/>
-          </w:tcPr>
-          <w:p>
-            <w:pPr>
-              <w:spacing w:before="40" w:after="40" w:line="276" w:lineRule="auto"/>
-              <w:jc w:val="left"/>
-            </w:pPr>
-            <w:r/>
-            <w:r>
-              <w:rPr>
-                <w:rFonts w:ascii="Calibri" w:hAnsi="Calibri"/>
-                <w:b w:val="0"/>
-                <w:i w:val="0"/>
-                <w:color w:val="000000"/>
-                <w:sz w:val="17"/>
-              </w:rPr>
-              <w:t>Verify authorization barriers between Student, Staff Evaluator, and Director roles, and test multi-factor authentication controls.</w:t>
-            </w:r>
-          </w:p>
-        </w:tc>
-        <w:tc>
-          <w:tcPr>
-            <w:tcW w:w="1872" w:type="dxa"/>
-          </w:tcPr>
-          <w:p>
-            <w:pPr>
-              <w:spacing w:before="40" w:after="40" w:line="276" w:lineRule="auto"/>
-              <w:jc w:val="left"/>
-            </w:pPr>
-            <w:r/>
-            <w:r>
-              <w:rPr>
-                <w:rFonts w:ascii="Calibri" w:hAnsi="Calibri"/>
-                <w:b w:val="0"/>
-                <w:i w:val="0"/>
-                <w:color w:val="000000"/>
-                <w:sz w:val="17"/>
-              </w:rPr>
-              <w:t>Unauthorized route access is blocked with strict HTTP 403 Forbidden; staff and director administrative controls remain inaccessible to students.</w:t>
-            </w:r>
-          </w:p>
-        </w:tc>
-        <w:tc>
-          <w:tcPr>
-            <w:tcW w:w="1872" w:type="dxa"/>
-          </w:tcPr>
-          <w:p>
-            <w:pPr>
-              <w:spacing w:before="40" w:after="40" w:line="276" w:lineRule="auto"/>
-              <w:jc w:val="left"/>
-            </w:pPr>
-            <w:r/>
-          </w:p>
-        </w:tc>
-        <w:tc>
-          <w:tcPr>
-            <w:tcW w:w="1512" w:type="dxa"/>
-          </w:tcPr>
-          <w:p>
-            <w:pPr>
-              <w:spacing w:before="40" w:after="40" w:line="276" w:lineRule="auto"/>
-              <w:jc w:val="left"/>
-            </w:pPr>
-            <w:r/>
-            <w:r>
-              <w:rPr>
-                <w:rFonts w:ascii="Calibri" w:hAnsi="Calibri"/>
-                <w:b w:val="0"/>
-                <w:i w:val="0"/>
-                <w:color w:val="000000"/>
-                <w:sz w:val="16"/>
-              </w:rPr>
-              <w:t>☐ Pass  ☐ Fail  ☐ Needs Revision  ☐ N/A</w:t>
-            </w:r>
-          </w:p>
-        </w:tc>
-        <w:tc>
-          <w:tcPr>
-            <w:tcW w:w="1512" w:type="dxa"/>
-          </w:tcPr>
-          <w:p>
-            <w:pPr>
-              <w:spacing w:before="40" w:after="40" w:line="276" w:lineRule="auto"/>
-              <w:jc w:val="left"/>
-            </w:pPr>
-            <w:r/>
-          </w:p>
-        </w:tc>
-      </w:tr>
-      <w:tr>
-        <w:trPr>
-          <w:jc w:val="center"/>
-        </w:trPr>
-        <w:tc>
-          <w:tcPr>
-            <w:tcW w:w="503" w:type="dxa"/>
-          </w:tcPr>
-          <w:p>
-            <w:pPr>
-              <w:spacing w:before="40" w:after="40" w:line="276" w:lineRule="auto"/>
-              <w:jc w:val="center"/>
-            </w:pPr>
-            <w:r/>
-            <w:r>
-              <w:rPr>
-                <w:rFonts w:ascii="Calibri" w:hAnsi="Calibri"/>
-                <w:b w:val="0"/>
-                <w:i w:val="0"/>
-                <w:color w:val="000000"/>
-                <w:sz w:val="18"/>
-              </w:rPr>
-              <w:t>10</w:t>
-            </w:r>
-          </w:p>
-        </w:tc>
-        <w:tc>
-          <w:tcPr>
-            <w:tcW w:w="1440" w:type="dxa"/>
-          </w:tcPr>
-          <w:p>
-            <w:pPr>
-              <w:spacing w:before="40" w:after="40" w:line="276" w:lineRule="auto"/>
-              <w:jc w:val="left"/>
-            </w:pPr>
-            <w:r>
-              <w:rPr>
-                <w:b/>
-              </w:rPr>
-            </w:r>
-            <w:r>
-              <w:rPr>
-                <w:rFonts w:ascii="Calibri" w:hAnsi="Calibri"/>
-                <w:b w:val="0"/>
-                <w:i w:val="0"/>
-                <w:color w:val="000000"/>
-                <w:sz w:val="18"/>
-              </w:rPr>
-              <w:t>Executive KPI Analytics &amp; Exportable Audit Trails</w:t>
-            </w:r>
-          </w:p>
-        </w:tc>
-        <w:tc>
-          <w:tcPr>
-            <w:tcW w:w="2088" w:type="dxa"/>
-          </w:tcPr>
-          <w:p>
-            <w:pPr>
-              <w:spacing w:before="40" w:after="40" w:line="276" w:lineRule="auto"/>
-              <w:jc w:val="left"/>
-            </w:pPr>
-            <w:r/>
-            <w:r>
-              <w:rPr>
-                <w:rFonts w:ascii="Calibri" w:hAnsi="Calibri"/>
-                <w:b w:val="0"/>
-                <w:i w:val="0"/>
-                <w:color w:val="000000"/>
-                <w:sz w:val="17"/>
-              </w:rPr>
-              <w:t>Director reviews system analytics dashboard (Grade Integrity Index, Applicant Distributions) and exports audit compliance reports (PDF/CSV).</w:t>
-            </w:r>
-          </w:p>
-        </w:tc>
-        <w:tc>
-          <w:tcPr>
-            <w:tcW w:w="1872" w:type="dxa"/>
-          </w:tcPr>
-          <w:p>
-            <w:pPr>
-              <w:spacing w:before="40" w:after="40" w:line="276" w:lineRule="auto"/>
-              <w:jc w:val="left"/>
-            </w:pPr>
-            <w:r/>
-            <w:r>
-              <w:rPr>
-                <w:rFonts w:ascii="Calibri" w:hAnsi="Calibri"/>
-                <w:b w:val="0"/>
-                <w:i w:val="0"/>
-                <w:color w:val="000000"/>
-                <w:sz w:val="17"/>
-              </w:rPr>
-              <w:t>Real-time metric counters and distribution charts render accurately; SHA-256 audit logs and summary reports export cleanly to PDF/CSV.</w:t>
+            <w:r>
+              <w:t>Real-time metric counters and quota progress bars render accurately; compliance records export to standardized CSV and PDF formatted for CHED StuFAPs and DOST-SEI institutional audits.</w:t>
             </w:r>
           </w:p>
         </w:tc>
@@ -2923,31 +2723,12 @@
             <w:vAlign w:val="center"/>
           </w:tcPr>
           <w:p>
-            <w:pPr>
-              <w:spacing w:before="40" w:after="40" w:line="276" w:lineRule="auto"/>
-              <w:jc w:val="center"/>
-            </w:pPr>
-            <w:r>
-              <w:rPr>
-                <w:b w:val="0"/>
-              </w:rPr>
-            </w:r>
-            <w:r>
-              <w:rPr>
-                <w:rFonts w:ascii="Calibri" w:hAnsi="Calibri"/>
-                <w:b w:val="0"/>
-                <w:i w:val="0"/>
-                <w:color w:val="000000"/>
-                <w:sz w:val="18"/>
-              </w:rPr>
-              <w:br/>
+            <w:r>
               <w:t>____________________________________</w:t>
               <w:br/>
-              <w:t>JOSHUA RAZON / NORIEL GADIANO / JOHN ANDREI CARILLO II</w:t>
+              <w:t>JOHN ANDREI CARILLO / NORIEL S. GADIANO / JOSHUA A. RAZON</w:t>
               <w:br/>
-              <w:t>Student Researchers / Project Leaders</w:t>
-              <w:br/>
-              <w:t>Signature over Printed Name</w:t>
+              <w:t>Student Researchers / Project Leaders Signature over Printed Name</w:t>
             </w:r>
           </w:p>
         </w:tc>
@@ -3105,24 +2886,8 @@
             <w:vAlign w:val="center"/>
           </w:tcPr>
           <w:p>
-            <w:pPr>
-              <w:spacing w:before="40" w:after="40" w:line="276" w:lineRule="auto"/>
-              <w:jc w:val="left"/>
-            </w:pPr>
-            <w:r>
-              <w:rPr>
-                <w:b/>
-              </w:rPr>
-            </w:r>
-            <w:r>
-              <w:rPr>
-                <w:rFonts w:ascii="Calibri" w:hAnsi="Calibri"/>
-                <w:b w:val="0"/>
-                <w:i w:val="0"/>
-                <w:color w:val="000000"/>
-                <w:sz w:val="18"/>
-              </w:rPr>
-              <w:t>A.E.G.I.S. (Automated Evaluation &amp; Grade Integrity System)</w:t>
+            <w:r>
+              <w:t>A.E.G.I.S: AI-ENHANCED GRANT INFORMATION SYSTEM WITH DOCUMENT FORENSICS AND AUTOMATED NOTIFICATION FOR THE OFFICE OF STUDENT AFFAIRS</w:t>
             </w:r>
           </w:p>
         </w:tc>

</xml_diff>